<commit_message>
BBM 433 CATs: course title 'Retail and Merchandise Management'; cover layout uses fixed-width 3-column table so labels:values stay on one line
</commit_message>
<xml_diff>
--- a/files/Mourice_BBM_433_CAT_1.docx
+++ b/files/Mourice_BBM_433_CAT_1.docx
@@ -106,266 +106,676 @@
         <w:t>DEPARTMENT OF MANAGEMENT SCIENCE &amp; ENTREPRENEURSHIP</w:t>
       </w:r>
     </w:p>
-    <w:p>
-      <w:pPr>
-        <w:spacing w:before="0" w:after="140" w:line="240" w:lineRule="auto"/>
-        <w:jc w:val="left"/>
-      </w:pPr>
-      <w:r>
-        <w:rPr>
-          <w:rFonts w:ascii="Times New Roman" w:hAnsi="Times New Roman"/>
-          <w:b/>
-          <w:i w:val="0"/>
-          <w:color w:val="000000"/>
-          <w:sz w:val="24"/>
-        </w:rPr>
-        <w:t xml:space="preserve">PROGRAMME         : </w:t>
-      </w:r>
-      <w:r>
-        <w:rPr>
-          <w:rFonts w:ascii="Times New Roman" w:hAnsi="Times New Roman"/>
-          <w:b w:val="0"/>
-          <w:i w:val="0"/>
-          <w:color w:val="000000"/>
-          <w:sz w:val="24"/>
-        </w:rPr>
-        <w:t>BACHELOR OF BUSINESS MANAGEMENT</w:t>
-      </w:r>
-    </w:p>
-    <w:p>
-      <w:pPr>
-        <w:spacing w:before="0" w:after="140" w:line="240" w:lineRule="auto"/>
-        <w:jc w:val="left"/>
-      </w:pPr>
-      <w:r>
-        <w:rPr>
-          <w:rFonts w:ascii="Times New Roman" w:hAnsi="Times New Roman"/>
-          <w:b/>
-          <w:i w:val="0"/>
-          <w:color w:val="000000"/>
-          <w:sz w:val="24"/>
-        </w:rPr>
-        <w:t xml:space="preserve">ACADEMIC YEAR     : </w:t>
-      </w:r>
-      <w:r>
-        <w:rPr>
-          <w:rFonts w:ascii="Times New Roman" w:hAnsi="Times New Roman"/>
-          <w:b w:val="0"/>
-          <w:i w:val="0"/>
-          <w:color w:val="000000"/>
-          <w:sz w:val="24"/>
-        </w:rPr>
-        <w:t>YEAR 4</w:t>
-      </w:r>
-    </w:p>
-    <w:p>
-      <w:pPr>
-        <w:spacing w:before="0" w:after="140" w:line="240" w:lineRule="auto"/>
-        <w:jc w:val="left"/>
-      </w:pPr>
-      <w:r>
-        <w:rPr>
-          <w:rFonts w:ascii="Times New Roman" w:hAnsi="Times New Roman"/>
-          <w:b/>
-          <w:i w:val="0"/>
-          <w:color w:val="000000"/>
-          <w:sz w:val="24"/>
-        </w:rPr>
-        <w:t xml:space="preserve">COURSE CODE       : </w:t>
-      </w:r>
-      <w:r>
-        <w:rPr>
-          <w:rFonts w:ascii="Times New Roman" w:hAnsi="Times New Roman"/>
-          <w:b w:val="0"/>
-          <w:i w:val="0"/>
-          <w:color w:val="000000"/>
-          <w:sz w:val="24"/>
-        </w:rPr>
-        <w:t>BBM 433</w:t>
-      </w:r>
-    </w:p>
-    <w:p>
-      <w:pPr>
-        <w:spacing w:before="0" w:after="140" w:line="240" w:lineRule="auto"/>
-        <w:jc w:val="left"/>
-      </w:pPr>
-      <w:r>
-        <w:rPr>
-          <w:rFonts w:ascii="Times New Roman" w:hAnsi="Times New Roman"/>
-          <w:b/>
-          <w:i w:val="0"/>
-          <w:color w:val="000000"/>
-          <w:sz w:val="24"/>
-        </w:rPr>
-        <w:t xml:space="preserve">COURSE TITLE      : </w:t>
-      </w:r>
-      <w:r>
-        <w:rPr>
-          <w:rFonts w:ascii="Times New Roman" w:hAnsi="Times New Roman"/>
-          <w:b w:val="0"/>
-          <w:i w:val="0"/>
-          <w:color w:val="000000"/>
-          <w:sz w:val="24"/>
-        </w:rPr>
-        <w:t>RETAIL AND MERCHANDISE</w:t>
-      </w:r>
-    </w:p>
-    <w:p>
-      <w:pPr>
-        <w:spacing w:before="0" w:after="140" w:line="240" w:lineRule="auto"/>
-        <w:jc w:val="left"/>
-      </w:pPr>
-      <w:r>
-        <w:rPr>
-          <w:rFonts w:ascii="Times New Roman" w:hAnsi="Times New Roman"/>
-          <w:b/>
-          <w:i w:val="0"/>
-          <w:color w:val="000000"/>
-          <w:sz w:val="24"/>
-        </w:rPr>
-        <w:t xml:space="preserve">SEMESTER          : </w:t>
-      </w:r>
-      <w:r>
-        <w:rPr>
-          <w:rFonts w:ascii="Times New Roman" w:hAnsi="Times New Roman"/>
-          <w:b w:val="0"/>
-          <w:i w:val="0"/>
-          <w:color w:val="000000"/>
-          <w:sz w:val="24"/>
-        </w:rPr>
-        <w:t>2025/26: SEM II</w:t>
-      </w:r>
-    </w:p>
-    <w:p>
-      <w:pPr>
-        <w:spacing w:before="0" w:after="140" w:line="240" w:lineRule="auto"/>
-        <w:jc w:val="left"/>
-      </w:pPr>
-      <w:r>
-        <w:rPr>
-          <w:rFonts w:ascii="Times New Roman" w:hAnsi="Times New Roman"/>
-          <w:b/>
-          <w:i w:val="0"/>
-          <w:color w:val="000000"/>
-          <w:sz w:val="24"/>
-        </w:rPr>
-        <w:t xml:space="preserve">ASSIGNMENT        : </w:t>
-      </w:r>
-      <w:r>
-        <w:rPr>
-          <w:rFonts w:ascii="Times New Roman" w:hAnsi="Times New Roman"/>
-          <w:b w:val="0"/>
-          <w:i w:val="0"/>
-          <w:color w:val="000000"/>
-          <w:sz w:val="24"/>
-        </w:rPr>
-        <w:t>CAT 1</w:t>
-      </w:r>
-    </w:p>
-    <w:p>
-      <w:pPr>
-        <w:spacing w:before="0" w:after="140" w:line="240" w:lineRule="auto"/>
-        <w:jc w:val="left"/>
-      </w:pPr>
-      <w:r>
-        <w:rPr>
-          <w:rFonts w:ascii="Times New Roman" w:hAnsi="Times New Roman"/>
-          <w:b/>
-          <w:i w:val="0"/>
-          <w:color w:val="000000"/>
-          <w:sz w:val="24"/>
-        </w:rPr>
-        <w:t xml:space="preserve">SUBMISSION DATE   : </w:t>
-      </w:r>
-      <w:r>
-        <w:rPr>
-          <w:rFonts w:ascii="Times New Roman" w:hAnsi="Times New Roman"/>
-          <w:b w:val="0"/>
-          <w:i w:val="0"/>
-          <w:color w:val="000000"/>
-          <w:sz w:val="24"/>
-        </w:rPr>
-        <w:t>24TH APRIL 2026</w:t>
-      </w:r>
-    </w:p>
-    <w:p>
-      <w:pPr>
-        <w:spacing w:before="0" w:after="140" w:line="240" w:lineRule="auto"/>
-        <w:jc w:val="left"/>
-      </w:pPr>
-      <w:r>
-        <w:rPr>
-          <w:rFonts w:ascii="Times New Roman" w:hAnsi="Times New Roman"/>
-          <w:b/>
-          <w:i w:val="0"/>
-          <w:color w:val="000000"/>
-          <w:sz w:val="24"/>
-        </w:rPr>
-        <w:t xml:space="preserve">MARKS             : </w:t>
-      </w:r>
-      <w:r>
-        <w:rPr>
-          <w:rFonts w:ascii="Times New Roman" w:hAnsi="Times New Roman"/>
-          <w:b w:val="0"/>
-          <w:i w:val="0"/>
-          <w:color w:val="000000"/>
-          <w:sz w:val="24"/>
-        </w:rPr>
-        <w:t>30 MARKS</w:t>
-      </w:r>
-    </w:p>
-    <w:p>
-      <w:pPr>
-        <w:spacing w:before="0" w:after="140" w:line="240" w:lineRule="auto"/>
-        <w:jc w:val="left"/>
-      </w:pPr>
-      <w:r>
-        <w:rPr>
-          <w:rFonts w:ascii="Times New Roman" w:hAnsi="Times New Roman"/>
-          <w:b/>
-          <w:i w:val="0"/>
-          <w:color w:val="000000"/>
-          <w:sz w:val="24"/>
-        </w:rPr>
-        <w:t xml:space="preserve">NAME              : </w:t>
-      </w:r>
-      <w:r>
-        <w:rPr>
-          <w:rFonts w:ascii="Times New Roman" w:hAnsi="Times New Roman"/>
-          <w:b w:val="0"/>
-          <w:i w:val="0"/>
-          <w:color w:val="000000"/>
-          <w:sz w:val="24"/>
-        </w:rPr>
-        <w:t>MOURICE ONYANGO</w:t>
-      </w:r>
-    </w:p>
-    <w:p>
-      <w:pPr>
-        <w:spacing w:before="0" w:after="140" w:line="240" w:lineRule="auto"/>
-        <w:jc w:val="left"/>
-      </w:pPr>
-      <w:r>
-        <w:rPr>
-          <w:rFonts w:ascii="Times New Roman" w:hAnsi="Times New Roman"/>
-          <w:b/>
-          <w:i w:val="0"/>
-          <w:color w:val="000000"/>
-          <w:sz w:val="24"/>
-        </w:rPr>
-        <w:t xml:space="preserve">REG NUMBER        : </w:t>
-      </w:r>
-      <w:r>
-        <w:rPr>
-          <w:rFonts w:ascii="Times New Roman" w:hAnsi="Times New Roman"/>
-          <w:b w:val="0"/>
-          <w:i w:val="0"/>
-          <w:color w:val="000000"/>
-          <w:sz w:val="24"/>
-        </w:rPr>
-        <w:t>BBM/1891/22</w:t>
-      </w:r>
-    </w:p>
+    <w:tbl>
+      <w:tblPr>
+        <w:tblW w:type="auto" w:w="0"/>
+        <w:tblLayout w:type="fixed"/>
+        <w:tblLook w:firstColumn="1" w:firstRow="1" w:lastColumn="0" w:lastRow="0" w:noHBand="0" w:noVBand="1" w:val="04A0"/>
+        <w:tblW w:w="9000" w:type="dxa"/>
+        <w:tblLayout w:type="fixed"/>
+        <w:tblCellMar>
+          <w:top w:w="20" w:type="dxa"/>
+          <w:left w:w="20" w:type="dxa"/>
+          <w:bottom w:w="20" w:type="dxa"/>
+          <w:right w:w="20" w:type="dxa"/>
+        </w:tblCellMar>
+      </w:tblPr>
+      <w:tblGrid>
+        <w:gridCol w:w="2808"/>
+        <w:gridCol w:w="240"/>
+        <w:gridCol w:w="5952"/>
+      </w:tblGrid>
+      <w:tr>
+        <w:tc>
+          <w:tcPr>
+            <w:tcW w:type="dxa" w:w="2808"/>
+            <w:vAlign w:val="top"/>
+          </w:tcPr>
+          <w:p>
+            <w:pPr>
+              <w:spacing w:before="0" w:after="80" w:line="240" w:lineRule="auto"/>
+            </w:pPr>
+            <w:r>
+              <w:rPr>
+                <w:rFonts w:ascii="Times New Roman" w:hAnsi="Times New Roman"/>
+                <w:b/>
+                <w:i w:val="0"/>
+                <w:color w:val="000000"/>
+                <w:sz w:val="24"/>
+              </w:rPr>
+              <w:t>PROGRAMME</w:t>
+            </w:r>
+          </w:p>
+        </w:tc>
+        <w:tc>
+          <w:tcPr>
+            <w:tcW w:type="dxa" w:w="240"/>
+            <w:vAlign w:val="top"/>
+          </w:tcPr>
+          <w:p>
+            <w:pPr>
+              <w:spacing w:before="0" w:after="80" w:line="240" w:lineRule="auto"/>
+            </w:pPr>
+            <w:r>
+              <w:rPr>
+                <w:rFonts w:ascii="Times New Roman" w:hAnsi="Times New Roman"/>
+                <w:b/>
+                <w:i w:val="0"/>
+                <w:color w:val="000000"/>
+                <w:sz w:val="24"/>
+              </w:rPr>
+              <w:t>:</w:t>
+            </w:r>
+          </w:p>
+        </w:tc>
+        <w:tc>
+          <w:tcPr>
+            <w:tcW w:type="dxa" w:w="5952"/>
+            <w:vAlign w:val="top"/>
+          </w:tcPr>
+          <w:p>
+            <w:pPr>
+              <w:spacing w:before="0" w:after="80" w:line="240" w:lineRule="auto"/>
+            </w:pPr>
+            <w:r>
+              <w:rPr>
+                <w:rFonts w:ascii="Times New Roman" w:hAnsi="Times New Roman"/>
+                <w:b w:val="0"/>
+                <w:i w:val="0"/>
+                <w:color w:val="000000"/>
+                <w:sz w:val="24"/>
+              </w:rPr>
+              <w:t>BACHELOR OF BUSINESS MANAGEMENT</w:t>
+            </w:r>
+          </w:p>
+        </w:tc>
+      </w:tr>
+      <w:tr>
+        <w:tc>
+          <w:tcPr>
+            <w:tcW w:type="dxa" w:w="2808"/>
+            <w:vAlign w:val="top"/>
+          </w:tcPr>
+          <w:p>
+            <w:pPr>
+              <w:spacing w:before="0" w:after="80" w:line="240" w:lineRule="auto"/>
+            </w:pPr>
+            <w:r>
+              <w:rPr>
+                <w:rFonts w:ascii="Times New Roman" w:hAnsi="Times New Roman"/>
+                <w:b/>
+                <w:i w:val="0"/>
+                <w:color w:val="000000"/>
+                <w:sz w:val="24"/>
+              </w:rPr>
+              <w:t>ACADEMIC YEAR</w:t>
+            </w:r>
+          </w:p>
+        </w:tc>
+        <w:tc>
+          <w:tcPr>
+            <w:tcW w:type="dxa" w:w="240"/>
+            <w:vAlign w:val="top"/>
+          </w:tcPr>
+          <w:p>
+            <w:pPr>
+              <w:spacing w:before="0" w:after="80" w:line="240" w:lineRule="auto"/>
+            </w:pPr>
+            <w:r>
+              <w:rPr>
+                <w:rFonts w:ascii="Times New Roman" w:hAnsi="Times New Roman"/>
+                <w:b/>
+                <w:i w:val="0"/>
+                <w:color w:val="000000"/>
+                <w:sz w:val="24"/>
+              </w:rPr>
+              <w:t>:</w:t>
+            </w:r>
+          </w:p>
+        </w:tc>
+        <w:tc>
+          <w:tcPr>
+            <w:tcW w:type="dxa" w:w="5952"/>
+            <w:vAlign w:val="top"/>
+          </w:tcPr>
+          <w:p>
+            <w:pPr>
+              <w:spacing w:before="0" w:after="80" w:line="240" w:lineRule="auto"/>
+            </w:pPr>
+            <w:r>
+              <w:rPr>
+                <w:rFonts w:ascii="Times New Roman" w:hAnsi="Times New Roman"/>
+                <w:b w:val="0"/>
+                <w:i w:val="0"/>
+                <w:color w:val="000000"/>
+                <w:sz w:val="24"/>
+              </w:rPr>
+              <w:t>YEAR 4</w:t>
+            </w:r>
+          </w:p>
+        </w:tc>
+      </w:tr>
+      <w:tr>
+        <w:tc>
+          <w:tcPr>
+            <w:tcW w:type="dxa" w:w="2808"/>
+            <w:vAlign w:val="top"/>
+          </w:tcPr>
+          <w:p>
+            <w:pPr>
+              <w:spacing w:before="0" w:after="80" w:line="240" w:lineRule="auto"/>
+            </w:pPr>
+            <w:r>
+              <w:rPr>
+                <w:rFonts w:ascii="Times New Roman" w:hAnsi="Times New Roman"/>
+                <w:b/>
+                <w:i w:val="0"/>
+                <w:color w:val="000000"/>
+                <w:sz w:val="24"/>
+              </w:rPr>
+              <w:t>COURSE CODE</w:t>
+            </w:r>
+          </w:p>
+        </w:tc>
+        <w:tc>
+          <w:tcPr>
+            <w:tcW w:type="dxa" w:w="240"/>
+            <w:vAlign w:val="top"/>
+          </w:tcPr>
+          <w:p>
+            <w:pPr>
+              <w:spacing w:before="0" w:after="80" w:line="240" w:lineRule="auto"/>
+            </w:pPr>
+            <w:r>
+              <w:rPr>
+                <w:rFonts w:ascii="Times New Roman" w:hAnsi="Times New Roman"/>
+                <w:b/>
+                <w:i w:val="0"/>
+                <w:color w:val="000000"/>
+                <w:sz w:val="24"/>
+              </w:rPr>
+              <w:t>:</w:t>
+            </w:r>
+          </w:p>
+        </w:tc>
+        <w:tc>
+          <w:tcPr>
+            <w:tcW w:type="dxa" w:w="5952"/>
+            <w:vAlign w:val="top"/>
+          </w:tcPr>
+          <w:p>
+            <w:pPr>
+              <w:spacing w:before="0" w:after="80" w:line="240" w:lineRule="auto"/>
+            </w:pPr>
+            <w:r>
+              <w:rPr>
+                <w:rFonts w:ascii="Times New Roman" w:hAnsi="Times New Roman"/>
+                <w:b w:val="0"/>
+                <w:i w:val="0"/>
+                <w:color w:val="000000"/>
+                <w:sz w:val="24"/>
+              </w:rPr>
+              <w:t>BBM 433</w:t>
+            </w:r>
+          </w:p>
+        </w:tc>
+      </w:tr>
+      <w:tr>
+        <w:tc>
+          <w:tcPr>
+            <w:tcW w:type="dxa" w:w="2808"/>
+            <w:vAlign w:val="top"/>
+          </w:tcPr>
+          <w:p>
+            <w:pPr>
+              <w:spacing w:before="0" w:after="80" w:line="240" w:lineRule="auto"/>
+            </w:pPr>
+            <w:r>
+              <w:rPr>
+                <w:rFonts w:ascii="Times New Roman" w:hAnsi="Times New Roman"/>
+                <w:b/>
+                <w:i w:val="0"/>
+                <w:color w:val="000000"/>
+                <w:sz w:val="24"/>
+              </w:rPr>
+              <w:t>COURSE TITLE</w:t>
+            </w:r>
+          </w:p>
+        </w:tc>
+        <w:tc>
+          <w:tcPr>
+            <w:tcW w:type="dxa" w:w="240"/>
+            <w:vAlign w:val="top"/>
+          </w:tcPr>
+          <w:p>
+            <w:pPr>
+              <w:spacing w:before="0" w:after="80" w:line="240" w:lineRule="auto"/>
+            </w:pPr>
+            <w:r>
+              <w:rPr>
+                <w:rFonts w:ascii="Times New Roman" w:hAnsi="Times New Roman"/>
+                <w:b/>
+                <w:i w:val="0"/>
+                <w:color w:val="000000"/>
+                <w:sz w:val="24"/>
+              </w:rPr>
+              <w:t>:</w:t>
+            </w:r>
+          </w:p>
+        </w:tc>
+        <w:tc>
+          <w:tcPr>
+            <w:tcW w:type="dxa" w:w="5952"/>
+            <w:vAlign w:val="top"/>
+          </w:tcPr>
+          <w:p>
+            <w:pPr>
+              <w:spacing w:before="0" w:after="80" w:line="240" w:lineRule="auto"/>
+            </w:pPr>
+            <w:r>
+              <w:rPr>
+                <w:rFonts w:ascii="Times New Roman" w:hAnsi="Times New Roman"/>
+                <w:b w:val="0"/>
+                <w:i w:val="0"/>
+                <w:color w:val="000000"/>
+                <w:sz w:val="24"/>
+              </w:rPr>
+              <w:t>RETAIL AND MERCHANDISE MANAGEMENT</w:t>
+            </w:r>
+          </w:p>
+        </w:tc>
+      </w:tr>
+      <w:tr>
+        <w:tc>
+          <w:tcPr>
+            <w:tcW w:type="dxa" w:w="2808"/>
+            <w:vAlign w:val="top"/>
+          </w:tcPr>
+          <w:p>
+            <w:pPr>
+              <w:spacing w:before="0" w:after="80" w:line="240" w:lineRule="auto"/>
+            </w:pPr>
+            <w:r>
+              <w:rPr>
+                <w:rFonts w:ascii="Times New Roman" w:hAnsi="Times New Roman"/>
+                <w:b/>
+                <w:i w:val="0"/>
+                <w:color w:val="000000"/>
+                <w:sz w:val="24"/>
+              </w:rPr>
+              <w:t>SEMESTER</w:t>
+            </w:r>
+          </w:p>
+        </w:tc>
+        <w:tc>
+          <w:tcPr>
+            <w:tcW w:type="dxa" w:w="240"/>
+            <w:vAlign w:val="top"/>
+          </w:tcPr>
+          <w:p>
+            <w:pPr>
+              <w:spacing w:before="0" w:after="80" w:line="240" w:lineRule="auto"/>
+            </w:pPr>
+            <w:r>
+              <w:rPr>
+                <w:rFonts w:ascii="Times New Roman" w:hAnsi="Times New Roman"/>
+                <w:b/>
+                <w:i w:val="0"/>
+                <w:color w:val="000000"/>
+                <w:sz w:val="24"/>
+              </w:rPr>
+              <w:t>:</w:t>
+            </w:r>
+          </w:p>
+        </w:tc>
+        <w:tc>
+          <w:tcPr>
+            <w:tcW w:type="dxa" w:w="5952"/>
+            <w:vAlign w:val="top"/>
+          </w:tcPr>
+          <w:p>
+            <w:pPr>
+              <w:spacing w:before="0" w:after="80" w:line="240" w:lineRule="auto"/>
+            </w:pPr>
+            <w:r>
+              <w:rPr>
+                <w:rFonts w:ascii="Times New Roman" w:hAnsi="Times New Roman"/>
+                <w:b w:val="0"/>
+                <w:i w:val="0"/>
+                <w:color w:val="000000"/>
+                <w:sz w:val="24"/>
+              </w:rPr>
+              <w:t>2025/26: SEM II</w:t>
+            </w:r>
+          </w:p>
+        </w:tc>
+      </w:tr>
+      <w:tr>
+        <w:tc>
+          <w:tcPr>
+            <w:tcW w:type="dxa" w:w="2808"/>
+            <w:vAlign w:val="top"/>
+          </w:tcPr>
+          <w:p>
+            <w:pPr>
+              <w:spacing w:before="0" w:after="80" w:line="240" w:lineRule="auto"/>
+            </w:pPr>
+            <w:r>
+              <w:rPr>
+                <w:rFonts w:ascii="Times New Roman" w:hAnsi="Times New Roman"/>
+                <w:b/>
+                <w:i w:val="0"/>
+                <w:color w:val="000000"/>
+                <w:sz w:val="24"/>
+              </w:rPr>
+              <w:t>ASSIGNMENT</w:t>
+            </w:r>
+          </w:p>
+        </w:tc>
+        <w:tc>
+          <w:tcPr>
+            <w:tcW w:type="dxa" w:w="240"/>
+            <w:vAlign w:val="top"/>
+          </w:tcPr>
+          <w:p>
+            <w:pPr>
+              <w:spacing w:before="0" w:after="80" w:line="240" w:lineRule="auto"/>
+            </w:pPr>
+            <w:r>
+              <w:rPr>
+                <w:rFonts w:ascii="Times New Roman" w:hAnsi="Times New Roman"/>
+                <w:b/>
+                <w:i w:val="0"/>
+                <w:color w:val="000000"/>
+                <w:sz w:val="24"/>
+              </w:rPr>
+              <w:t>:</w:t>
+            </w:r>
+          </w:p>
+        </w:tc>
+        <w:tc>
+          <w:tcPr>
+            <w:tcW w:type="dxa" w:w="5952"/>
+            <w:vAlign w:val="top"/>
+          </w:tcPr>
+          <w:p>
+            <w:pPr>
+              <w:spacing w:before="0" w:after="80" w:line="240" w:lineRule="auto"/>
+            </w:pPr>
+            <w:r>
+              <w:rPr>
+                <w:rFonts w:ascii="Times New Roman" w:hAnsi="Times New Roman"/>
+                <w:b w:val="0"/>
+                <w:i w:val="0"/>
+                <w:color w:val="000000"/>
+                <w:sz w:val="24"/>
+              </w:rPr>
+              <w:t>CAT 1</w:t>
+            </w:r>
+          </w:p>
+        </w:tc>
+      </w:tr>
+      <w:tr>
+        <w:tc>
+          <w:tcPr>
+            <w:tcW w:type="dxa" w:w="2808"/>
+            <w:vAlign w:val="top"/>
+          </w:tcPr>
+          <w:p>
+            <w:pPr>
+              <w:spacing w:before="0" w:after="80" w:line="240" w:lineRule="auto"/>
+            </w:pPr>
+            <w:r>
+              <w:rPr>
+                <w:rFonts w:ascii="Times New Roman" w:hAnsi="Times New Roman"/>
+                <w:b/>
+                <w:i w:val="0"/>
+                <w:color w:val="000000"/>
+                <w:sz w:val="24"/>
+              </w:rPr>
+              <w:t>SUBMISSION DATE</w:t>
+            </w:r>
+          </w:p>
+        </w:tc>
+        <w:tc>
+          <w:tcPr>
+            <w:tcW w:type="dxa" w:w="240"/>
+            <w:vAlign w:val="top"/>
+          </w:tcPr>
+          <w:p>
+            <w:pPr>
+              <w:spacing w:before="0" w:after="80" w:line="240" w:lineRule="auto"/>
+            </w:pPr>
+            <w:r>
+              <w:rPr>
+                <w:rFonts w:ascii="Times New Roman" w:hAnsi="Times New Roman"/>
+                <w:b/>
+                <w:i w:val="0"/>
+                <w:color w:val="000000"/>
+                <w:sz w:val="24"/>
+              </w:rPr>
+              <w:t>:</w:t>
+            </w:r>
+          </w:p>
+        </w:tc>
+        <w:tc>
+          <w:tcPr>
+            <w:tcW w:type="dxa" w:w="5952"/>
+            <w:vAlign w:val="top"/>
+          </w:tcPr>
+          <w:p>
+            <w:pPr>
+              <w:spacing w:before="0" w:after="80" w:line="240" w:lineRule="auto"/>
+            </w:pPr>
+            <w:r>
+              <w:rPr>
+                <w:rFonts w:ascii="Times New Roman" w:hAnsi="Times New Roman"/>
+                <w:b w:val="0"/>
+                <w:i w:val="0"/>
+                <w:color w:val="000000"/>
+                <w:sz w:val="24"/>
+              </w:rPr>
+              <w:t>24TH APRIL 2026</w:t>
+            </w:r>
+          </w:p>
+        </w:tc>
+      </w:tr>
+      <w:tr>
+        <w:tc>
+          <w:tcPr>
+            <w:tcW w:type="dxa" w:w="2808"/>
+            <w:vAlign w:val="top"/>
+          </w:tcPr>
+          <w:p>
+            <w:pPr>
+              <w:spacing w:before="0" w:after="80" w:line="240" w:lineRule="auto"/>
+            </w:pPr>
+            <w:r>
+              <w:rPr>
+                <w:rFonts w:ascii="Times New Roman" w:hAnsi="Times New Roman"/>
+                <w:b/>
+                <w:i w:val="0"/>
+                <w:color w:val="000000"/>
+                <w:sz w:val="24"/>
+              </w:rPr>
+              <w:t>MARKS</w:t>
+            </w:r>
+          </w:p>
+        </w:tc>
+        <w:tc>
+          <w:tcPr>
+            <w:tcW w:type="dxa" w:w="240"/>
+            <w:vAlign w:val="top"/>
+          </w:tcPr>
+          <w:p>
+            <w:pPr>
+              <w:spacing w:before="0" w:after="80" w:line="240" w:lineRule="auto"/>
+            </w:pPr>
+            <w:r>
+              <w:rPr>
+                <w:rFonts w:ascii="Times New Roman" w:hAnsi="Times New Roman"/>
+                <w:b/>
+                <w:i w:val="0"/>
+                <w:color w:val="000000"/>
+                <w:sz w:val="24"/>
+              </w:rPr>
+              <w:t>:</w:t>
+            </w:r>
+          </w:p>
+        </w:tc>
+        <w:tc>
+          <w:tcPr>
+            <w:tcW w:type="dxa" w:w="5952"/>
+            <w:vAlign w:val="top"/>
+          </w:tcPr>
+          <w:p>
+            <w:pPr>
+              <w:spacing w:before="0" w:after="80" w:line="240" w:lineRule="auto"/>
+            </w:pPr>
+            <w:r>
+              <w:rPr>
+                <w:rFonts w:ascii="Times New Roman" w:hAnsi="Times New Roman"/>
+                <w:b w:val="0"/>
+                <w:i w:val="0"/>
+                <w:color w:val="000000"/>
+                <w:sz w:val="24"/>
+              </w:rPr>
+              <w:t>30 MARKS</w:t>
+            </w:r>
+          </w:p>
+        </w:tc>
+      </w:tr>
+      <w:tr>
+        <w:tc>
+          <w:tcPr>
+            <w:tcW w:type="dxa" w:w="2808"/>
+            <w:vAlign w:val="top"/>
+          </w:tcPr>
+          <w:p>
+            <w:pPr>
+              <w:spacing w:before="0" w:after="80" w:line="240" w:lineRule="auto"/>
+            </w:pPr>
+            <w:r>
+              <w:rPr>
+                <w:rFonts w:ascii="Times New Roman" w:hAnsi="Times New Roman"/>
+                <w:b/>
+                <w:i w:val="0"/>
+                <w:color w:val="000000"/>
+                <w:sz w:val="24"/>
+              </w:rPr>
+              <w:t>NAME</w:t>
+            </w:r>
+          </w:p>
+        </w:tc>
+        <w:tc>
+          <w:tcPr>
+            <w:tcW w:type="dxa" w:w="240"/>
+            <w:vAlign w:val="top"/>
+          </w:tcPr>
+          <w:p>
+            <w:pPr>
+              <w:spacing w:before="0" w:after="80" w:line="240" w:lineRule="auto"/>
+            </w:pPr>
+            <w:r>
+              <w:rPr>
+                <w:rFonts w:ascii="Times New Roman" w:hAnsi="Times New Roman"/>
+                <w:b/>
+                <w:i w:val="0"/>
+                <w:color w:val="000000"/>
+                <w:sz w:val="24"/>
+              </w:rPr>
+              <w:t>:</w:t>
+            </w:r>
+          </w:p>
+        </w:tc>
+        <w:tc>
+          <w:tcPr>
+            <w:tcW w:type="dxa" w:w="5952"/>
+            <w:vAlign w:val="top"/>
+          </w:tcPr>
+          <w:p>
+            <w:pPr>
+              <w:spacing w:before="0" w:after="80" w:line="240" w:lineRule="auto"/>
+            </w:pPr>
+            <w:r>
+              <w:rPr>
+                <w:rFonts w:ascii="Times New Roman" w:hAnsi="Times New Roman"/>
+                <w:b w:val="0"/>
+                <w:i w:val="0"/>
+                <w:color w:val="000000"/>
+                <w:sz w:val="24"/>
+              </w:rPr>
+              <w:t>MOURICE ONYANGO</w:t>
+            </w:r>
+          </w:p>
+        </w:tc>
+      </w:tr>
+      <w:tr>
+        <w:tc>
+          <w:tcPr>
+            <w:tcW w:type="dxa" w:w="2808"/>
+            <w:vAlign w:val="top"/>
+          </w:tcPr>
+          <w:p>
+            <w:pPr>
+              <w:spacing w:before="0" w:after="80" w:line="240" w:lineRule="auto"/>
+            </w:pPr>
+            <w:r>
+              <w:rPr>
+                <w:rFonts w:ascii="Times New Roman" w:hAnsi="Times New Roman"/>
+                <w:b/>
+                <w:i w:val="0"/>
+                <w:color w:val="000000"/>
+                <w:sz w:val="24"/>
+              </w:rPr>
+              <w:t>REG NUMBER</w:t>
+            </w:r>
+          </w:p>
+        </w:tc>
+        <w:tc>
+          <w:tcPr>
+            <w:tcW w:type="dxa" w:w="240"/>
+            <w:vAlign w:val="top"/>
+          </w:tcPr>
+          <w:p>
+            <w:pPr>
+              <w:spacing w:before="0" w:after="80" w:line="240" w:lineRule="auto"/>
+            </w:pPr>
+            <w:r>
+              <w:rPr>
+                <w:rFonts w:ascii="Times New Roman" w:hAnsi="Times New Roman"/>
+                <w:b/>
+                <w:i w:val="0"/>
+                <w:color w:val="000000"/>
+                <w:sz w:val="24"/>
+              </w:rPr>
+              <w:t>:</w:t>
+            </w:r>
+          </w:p>
+        </w:tc>
+        <w:tc>
+          <w:tcPr>
+            <w:tcW w:type="dxa" w:w="5952"/>
+            <w:vAlign w:val="top"/>
+          </w:tcPr>
+          <w:p>
+            <w:pPr>
+              <w:spacing w:before="0" w:after="80" w:line="240" w:lineRule="auto"/>
+            </w:pPr>
+            <w:r>
+              <w:rPr>
+                <w:rFonts w:ascii="Times New Roman" w:hAnsi="Times New Roman"/>
+                <w:b w:val="0"/>
+                <w:i w:val="0"/>
+                <w:color w:val="000000"/>
+                <w:sz w:val="24"/>
+              </w:rPr>
+              <w:t>BBM/1891/22</w:t>
+            </w:r>
+          </w:p>
+        </w:tc>
+      </w:tr>
+    </w:tbl>
     <w:p>
       <w:r>
         <w:br w:type="page"/>

</xml_diff>